<commit_message>
docs(DA-968): viết lại spec/sequence-flow 34 FR sang tiếng Anh theo format chuẩn
- spec.md chuyển sang template chuẩn (Function Trigger / Description / Screen Layout / Details / Functionalities / Post-Conditions)
- spec.docx + sequence-flow.md regenerate tiếng Anh, bỏ mọi nhắc đến BE/FE
</commit_message>
<xml_diff>
--- a/docs/feature/agency-workspace/3-4-1-list-agency/spec.docx
+++ b/docs/feature/agency-workspace/3-4-1-list-agency/spec.docx
@@ -8,7 +8,7 @@
           <w:b/>
           <w:sz w:val="26"/>
         </w:rPr>
-        <w:t>FR 3.4.1 List Agency</w:t>
+        <w:t>3.4.1 List Agency</w:t>
       </w:r>
     </w:p>
     <w:p>
@@ -22,7 +22,7 @@
     </w:p>
     <w:p>
       <w:r>
-        <w:t>User navigates to the Agencies landing page (/agencies) after login.</w:t>
+        <w:t>The user navigates to the Agencies page (`/agencies`) after signing in. This is the default landing page when the user already owns or belongs to at least one Agency.</w:t>
       </w:r>
     </w:p>
     <w:p>
@@ -48,7 +48,7 @@
         <w:t xml:space="preserve">Actors / Roles: </w:t>
       </w:r>
       <w:r>
-        <w:t>User (as Agency Owner or Member).</w:t>
+        <w:t>Signed-in user (Agency Owner or Agency Member).</w:t>
       </w:r>
     </w:p>
     <w:p>
@@ -65,7 +65,7 @@
         <w:t xml:space="preserve">Purpose: </w:t>
       </w:r>
       <w:r>
-        <w:t>Show the list of Agencies the current user owns or belongs to, so they can pick one to manage.</w:t>
+        <w:t>Present every Agency the current user owns or belongs to, so the user can pick one to manage.</w:t>
       </w:r>
     </w:p>
     <w:p>
@@ -82,7 +82,7 @@
         <w:t xml:space="preserve">Interface: </w:t>
       </w:r>
       <w:r>
-        <w:t>Agencies list page (/agencies) — landing page after login if the user has at least 1 Agency; otherwise an empty state prompting to create one.</w:t>
+        <w:t>Agencies page (`/agencies`) — a grid of Agency cards showing name, logo and category, plus an empty state with a "Create new Agency" call to action when the user owns or belongs to no Agency.</w:t>
       </w:r>
     </w:p>
     <w:p>
@@ -99,7 +99,7 @@
         <w:t xml:space="preserve">Data Processing: </w:t>
       </w:r>
       <w:r>
-        <w:t>GET /api/v1/agencies. AgencyServiceImpl.listMyAgencies merges Agencies where ownerId = current user (findByOwnerIdAndStatusNot) with Agencies where the user has an AgencyMember record (agencyMemberRepository.findByUserId), excluding SOFT_DELETED.</w:t>
+        <w:t>The system merges the Agencies where the user is the Owner with the Agencies where the user holds an Agency Member record, de-duplicates the two sources, excludes soft-deleted Agencies, and returns the combined list together with the full profile of each Agency.</w:t>
       </w:r>
     </w:p>
     <w:p>
@@ -113,7 +113,7 @@
     </w:p>
     <w:p>
       <w:r>
-        <w:t>Figure: Agency list page — grid/list of Agency cards, each showing name, logo, category, and a 'Create new Agency' button.</w:t>
+        <w:t>Figure — Agencies page:</w:t>
       </w:r>
     </w:p>
     <w:p>
@@ -124,7 +124,7 @@
         <w:t xml:space="preserve">-  </w:t>
       </w:r>
       <w:r>
-        <w:t>Card click navigates into the Agency (currently reuses FR 3.4.4 View Agency Profile GET, since FR 3.4.2 Dashboard has no endpoint yet).</w:t>
+        <w:t>A card per Agency, each showing name, logo and category.</w:t>
       </w:r>
     </w:p>
     <w:p>
@@ -135,7 +135,18 @@
         <w:t xml:space="preserve">-  </w:t>
       </w:r>
       <w:r>
-        <w:t>Empty state with call-to-action when the user has no Agency yet.</w:t>
+        <w:t>Selecting a card moves the user into that Agency. The Agency Dashboard (3.4.2) has no screen of its own yet, so the Agency Profile (3.4.4) is shown in the meantime.</w:t>
+      </w:r>
+    </w:p>
+    <w:p>
+      <w:pPr>
+        <w:ind w:left="360"/>
+      </w:pPr>
+      <w:r>
+        <w:t xml:space="preserve">-  </w:t>
+      </w:r>
+      <w:r>
+        <w:t>Empty state with a "Create new Agency" call to action when the user owns or belongs to no Agency.</w:t>
       </w:r>
     </w:p>
     <w:p>
@@ -160,7 +171,18 @@
         <w:t xml:space="preserve">Input required: </w:t>
       </w:r>
       <w:r>
-        <w:t>None (no query params/filters in current API).</w:t>
+        <w:t>None — the request carries no parameters and no filters.</w:t>
+      </w:r>
+    </w:p>
+    <w:p>
+      <w:r>
+        <w:rPr>
+          <w:b/>
+        </w:rPr>
+        <w:t xml:space="preserve">Input optional: </w:t>
+      </w:r>
+      <w:r>
+        <w:t>None.</w:t>
       </w:r>
     </w:p>
     <w:p>
@@ -171,7 +193,7 @@
         <w:t xml:space="preserve">System data: </w:t>
       </w:r>
       <w:r>
-        <w:t>AgencyResponse: id (UUID), name, ownerId (UUID), logoUrl, description, category (enum AgencyCategory: MARKETING, FNB, FASHION, BEAUTY, TECHNOLOGY, REAL_ESTATE, EDUCATION, HEALTHCARE, RETAIL, FINANCE, ENTERTAINMENT, OTHER), companySize (enum CompanySize: SIZE_1_10, SIZE_11_50, SIZE_51_200, SIZE_201_500, SIZE_500_PLUS), website, phone, location, brandColor, logoIcon, tagline, foundedYear, facebookUrl, linkedinUrl, instagramUrl, status (enum EntityStatus: ACTIVE / SOFT_DELETED), createdAt, updatedAt.</w:t>
+        <w:t>Agency profile — id (UUID), name, ownerId (UUID), logoUrl, description, category (AgencyCategory: MARKETING, FNB, FASHION, BEAUTY, TECHNOLOGY, REAL_ESTATE, EDUCATION, HEALTHCARE, RETAIL, FINANCE, ENTERTAINMENT, OTHER), companySize (CompanySize: SIZE_1_10, SIZE_11_50, SIZE_51_200, SIZE_201_500, SIZE_500_PLUS), website, phone, location, brandColor, logoIcon, tagline, foundedYear, facebookUrl, linkedinUrl, instagramUrl, status (EntityStatus: ACTIVE / SOFT_DELETED), createdAt, updatedAt.</w:t>
       </w:r>
     </w:p>
     <w:p>
@@ -182,7 +204,7 @@
         <w:t xml:space="preserve">Output: </w:t>
       </w:r>
       <w:r>
-        <w:t>200 { success: true, data: [ AgencyResponse, ... ] } — empty array if the user has no Agency.</w:t>
+        <w:t>The list of Agencies that match the current user, each with the full profile above; an empty list when the user owns or belongs to none.</w:t>
       </w:r>
     </w:p>
     <w:p>
@@ -195,10 +217,10 @@
         <w:rPr>
           <w:b/>
         </w:rPr>
-        <w:t xml:space="preserve">BR-1: </w:t>
+        <w:t xml:space="preserve">BR-01: </w:t>
       </w:r>
       <w:r>
-        <w:t>List includes Agencies where current user is Owner (ownerId match) OR has an AgencyMember record (Owner or Member role).</w:t>
+        <w:t>The list contains the Agencies where the current user is the Owner, plus the Agencies where the user holds an Agency Member record (whatever the role).</w:t>
       </w:r>
     </w:p>
     <w:p>
@@ -206,10 +228,10 @@
         <w:rPr>
           <w:b/>
         </w:rPr>
-        <w:t xml:space="preserve">BR-2: </w:t>
+        <w:t xml:space="preserve">BR-02: </w:t>
       </w:r>
       <w:r>
-        <w:t>SOFT_DELETED Agencies are excluded from the list.</w:t>
+        <w:t>Agencies whose status is SOFT_DELETED are left out of the list.</w:t>
       </w:r>
     </w:p>
     <w:p>
@@ -217,10 +239,21 @@
         <w:rPr>
           <w:b/>
         </w:rPr>
-        <w:t xml:space="preserve">BR-3: </w:t>
+        <w:t xml:space="preserve">BR-03: </w:t>
       </w:r>
       <w:r>
-        <w:t>Response does not include a pre-computed workspaceCount field.</w:t>
+        <w:t>The result carries no pre-computed workspace count.</w:t>
+      </w:r>
+    </w:p>
+    <w:p>
+      <w:r>
+        <w:rPr>
+          <w:b/>
+        </w:rPr>
+        <w:t xml:space="preserve">BR-04: </w:t>
+      </w:r>
+      <w:r>
+        <w:t>Selecting an Agency leads to the Agency Dashboard (3.4.2). That screen has no data source of its own yet, so the Agency Profile (3.4.4) stands in until it is built.</w:t>
       </w:r>
     </w:p>
     <w:p>
@@ -230,7 +263,7 @@
     </w:p>
     <w:p>
       <w:r>
-        <w:t>No special validation — always returns a list (possibly empty).</w:t>
+        <w:t>None — the operation returns a list for every signed-in user, including an empty one.</w:t>
       </w:r>
     </w:p>
     <w:p>
@@ -249,22 +282,27 @@
     </w:p>
     <w:p>
       <w:r>
-        <w:t>1. User opens /agencies.</w:t>
+        <w:t>1. The user opens the Agencies page.</w:t>
       </w:r>
     </w:p>
     <w:p>
       <w:r>
-        <w:t>2. FE calls GET /api/v1/agencies with the authenticated user's token.</w:t>
+        <w:t>2. The client requests the Agency list of the signed-in user.</w:t>
       </w:r>
     </w:p>
     <w:p>
       <w:r>
-        <w:t>3. BE (listMyAgencies) merges owner + member Agencies, excludes SOFT_DELETED, returns list.</w:t>
+        <w:t>3. The system gathers the Agencies owned by the user and the Agencies where the user holds a membership, merges and de-duplicates both sources, drops soft-deleted entries, and returns the result.</w:t>
       </w:r>
     </w:p>
     <w:p>
       <w:r>
-        <w:t>4. FE renders Agency cards; if empty, shows empty state with 'Create Agency' CTA.</w:t>
+        <w:t>4. The client renders one card per Agency, showing name, logo and category.</w:t>
+      </w:r>
+    </w:p>
+    <w:p>
+      <w:r>
+        <w:t>5. The user selects a card to move into that Agency.</w:t>
       </w:r>
     </w:p>
     <w:p>
@@ -274,7 +312,12 @@
     </w:p>
     <w:p>
       <w:r>
-        <w:t>No dedicated error responses — a new user with 0 Agencies simply receives an empty array, not an error.</w:t>
+        <w:t>The user owns and belongs to no Agency: an empty list is returned rather than an error, and the client shows the empty state with the "Create new Agency" call to action.</w:t>
+      </w:r>
+    </w:p>
+    <w:p>
+      <w:r>
+        <w:t>No signed-in session: the request is rejected with `401 UNAUTHORIZED` before any Agency logic runs.</w:t>
       </w:r>
     </w:p>
     <w:p>
@@ -294,7 +337,18 @@
         <w:t xml:space="preserve">-  </w:t>
       </w:r>
       <w:r>
-        <w:t>The list accurately reflects only Agencies the user owns or is a member of, excluding soft-deleted ones.</w:t>
+        <w:t>The list reflects exactly the Agencies the current user owns or belongs to, with soft-deleted Agencies excluded.</w:t>
+      </w:r>
+    </w:p>
+    <w:p>
+      <w:pPr>
+        <w:ind w:left="360"/>
+      </w:pPr>
+      <w:r>
+        <w:t xml:space="preserve">-  </w:t>
+      </w:r>
+      <w:r>
+        <w:t>No Agency data is created, changed or removed.</w:t>
       </w:r>
     </w:p>
     <w:sectPr>

</xml_diff>

<commit_message>
Refactor authentication and profile management documentation
- Updated the Sign Out specification to clarify data processing and validation rules.
- Revised the Deactivate Account specification to enhance clarity on user identity verification and post-conditions.
- Improved the View User Profile documentation for better readability and structure.
- Enhanced the Update Profile specification to detail the avatar upload process and validation requirements.
- Clarified the View Client Profile and Update Client Profile specifications, emphasizing the independence of client profiles across agencies and the upsert behavior.
</commit_message>
<xml_diff>
--- a/docs/feature/agency-workspace/3-4-1-list-agency/spec.docx
+++ b/docs/feature/agency-workspace/3-4-1-list-agency/spec.docx
@@ -120,9 +120,7 @@
       <w:pPr>
         <w:ind w:left="360"/>
       </w:pPr>
-      <w:r>
-        <w:t xml:space="preserve">-  </w:t>
-      </w:r>
+      <w:r/>
       <w:r>
         <w:t>A card per Agency, each showing name, logo and category.</w:t>
       </w:r>
@@ -131,9 +129,7 @@
       <w:pPr>
         <w:ind w:left="360"/>
       </w:pPr>
-      <w:r>
-        <w:t xml:space="preserve">-  </w:t>
-      </w:r>
+      <w:r/>
       <w:r>
         <w:t>Selecting a card moves the user into that Agency. The Agency Dashboard (3.4.2) has no screen of its own yet, so the Agency Profile (3.4.4) is shown in the meantime.</w:t>
       </w:r>
@@ -142,9 +138,7 @@
       <w:pPr>
         <w:ind w:left="360"/>
       </w:pPr>
-      <w:r>
-        <w:t xml:space="preserve">-  </w:t>
-      </w:r>
+      <w:r/>
       <w:r>
         <w:t>Empty state with a "Create new Agency" call to action when the user owns or belongs to no Agency.</w:t>
       </w:r>
@@ -333,9 +327,7 @@
       <w:pPr>
         <w:ind w:left="360"/>
       </w:pPr>
-      <w:r>
-        <w:t xml:space="preserve">-  </w:t>
-      </w:r>
+      <w:r/>
       <w:r>
         <w:t>The list reflects exactly the Agencies the current user owns or belongs to, with soft-deleted Agencies excluded.</w:t>
       </w:r>
@@ -344,9 +336,7 @@
       <w:pPr>
         <w:ind w:left="360"/>
       </w:pPr>
-      <w:r>
-        <w:t xml:space="preserve">-  </w:t>
-      </w:r>
+      <w:r/>
       <w:r>
         <w:t>No Agency data is created, changed or removed.</w:t>
       </w:r>

</xml_diff>

<commit_message>
Refactor user profile and client profile specifications
- Updated business rules for viewing and updating user profiles to clarify identity resolution and default values.
- Enhanced validation messages for better user feedback during profile updates.
- Improved functional flows for updating client profiles, ensuring clarity on upsert behavior and immediate synchronization across workspaces.
- Added implementation notes to clarify structural constraints on email and role fields during updates.
- Ensured consistent error handling and messaging across all profile-related functionalities.
</commit_message>
<xml_diff>
--- a/docs/feature/agency-workspace/3-4-1-list-agency/spec.docx
+++ b/docs/feature/agency-workspace/3-4-1-list-agency/spec.docx
@@ -208,44 +208,20 @@
     </w:p>
     <w:p>
       <w:r>
-        <w:rPr>
-          <w:b/>
-        </w:rPr>
-        <w:t xml:space="preserve">BR-01: </w:t>
-      </w:r>
-      <w:r>
-        <w:t>The list contains the Agencies where the current user is the Owner, plus the Agencies where the user holds an Agency Member record (whatever the role).</w:t>
+        <w:t>BR-29: Multi-tenancy — the list is scoped to the current user: the Agencies where the user is the Owner, plus the Agencies where the user holds an Agency Member record (whatever the role). A user with no active membership or ownership sees nothing beyond that scope.</w:t>
       </w:r>
     </w:p>
     <w:p>
-      <w:r>
-        <w:rPr>
-          <w:b/>
-        </w:rPr>
-        <w:t xml:space="preserve">BR-02: </w:t>
-      </w:r>
       <w:r>
         <w:t>Agencies whose status is SOFT_DELETED are left out of the list.</w:t>
       </w:r>
     </w:p>
     <w:p>
       <w:r>
-        <w:rPr>
-          <w:b/>
-        </w:rPr>
-        <w:t xml:space="preserve">BR-03: </w:t>
-      </w:r>
-      <w:r>
         <w:t>The result carries no pre-computed workspace count.</w:t>
       </w:r>
     </w:p>
     <w:p>
-      <w:r>
-        <w:rPr>
-          <w:b/>
-        </w:rPr>
-        <w:t xml:space="preserve">BR-04: </w:t>
-      </w:r>
       <w:r>
         <w:t>Selecting an Agency leads to the Agency Dashboard (3.4.2). That screen has no data source of its own yet, so the Agency Profile (3.4.4) stands in until it is built.</w:t>
       </w:r>

</xml_diff>